<commit_message>
more s-parameters and test reports
</commit_message>
<xml_diff>
--- a/Analog-Signal-Components/PAX/PAM-2025/PAM-modules/detector-module/detector-module-v2/Jan26_production/module026_report.docx
+++ b/Analog-Signal-Components/PAX/PAM-2025/PAM-modules/detector-module/detector-module-v2/Jan26_production/module026_report.docx
@@ -323,6 +323,50 @@
         <w:rPr>
           <w:b/>
           <w:bCs/>
+          <w:noProof/>
+          <w:sz w:val="28"/>
+          <w:szCs w:val="28"/>
+        </w:rPr>
+        <w:drawing>
+          <wp:inline distT="0" distB="0" distL="0" distR="0" wp14:anchorId="5B787DDA" wp14:editId="74A1A724">
+            <wp:extent cx="5972810" cy="4778375"/>
+            <wp:effectExtent l="0" t="0" r="0" b="0"/>
+            <wp:docPr id="337790267" name="Picture 1"/>
+            <wp:cNvGraphicFramePr>
+              <a:graphicFrameLocks xmlns:a="http://schemas.openxmlformats.org/drawingml/2006/main" noChangeAspect="1"/>
+            </wp:cNvGraphicFramePr>
+            <a:graphic xmlns:a="http://schemas.openxmlformats.org/drawingml/2006/main">
+              <a:graphicData uri="http://schemas.openxmlformats.org/drawingml/2006/picture">
+                <pic:pic xmlns:pic="http://schemas.openxmlformats.org/drawingml/2006/picture">
+                  <pic:nvPicPr>
+                    <pic:cNvPr id="337790267" name="Picture 337790267"/>
+                    <pic:cNvPicPr/>
+                  </pic:nvPicPr>
+                  <pic:blipFill>
+                    <a:blip r:embed="rId6"/>
+                    <a:stretch>
+                      <a:fillRect/>
+                    </a:stretch>
+                  </pic:blipFill>
+                  <pic:spPr>
+                    <a:xfrm>
+                      <a:off x="0" y="0"/>
+                      <a:ext cx="5972810" cy="4778375"/>
+                    </a:xfrm>
+                    <a:prstGeom prst="rect">
+                      <a:avLst/>
+                    </a:prstGeom>
+                  </pic:spPr>
+                </pic:pic>
+              </a:graphicData>
+            </a:graphic>
+          </wp:inline>
+        </w:drawing>
+      </w:r>
+      <w:r>
+        <w:rPr>
+          <w:b/>
+          <w:bCs/>
           <w:sz w:val="28"/>
           <w:szCs w:val="28"/>
         </w:rPr>
@@ -369,7 +413,7 @@
                     <pic:cNvPicPr/>
                   </pic:nvPicPr>
                   <pic:blipFill>
-                    <a:blip r:embed="rId6" cstate="print">
+                    <a:blip r:embed="rId7" cstate="print">
                       <a:extLst>
                         <a:ext uri="{28A0092B-C50C-407E-A947-70E740481C1C}">
                           <a14:useLocalDpi xmlns:a14="http://schemas.microsoft.com/office/drawing/2010/main" val="0"/>
@@ -563,7 +607,7 @@
           <w:noProof/>
         </w:rPr>
         <w:drawing>
-          <wp:anchor distT="0" distB="0" distL="114300" distR="114300" simplePos="0" relativeHeight="251664384" behindDoc="0" locked="0" layoutInCell="1" allowOverlap="1" wp14:anchorId="6F775B1C" wp14:editId="2329D5E7">
+          <wp:anchor distT="0" distB="0" distL="114300" distR="114300" simplePos="0" relativeHeight="251664384" behindDoc="0" locked="0" layoutInCell="1" allowOverlap="1" wp14:anchorId="6F775B1C" wp14:editId="2BAE7D5D">
             <wp:simplePos x="0" y="0"/>
             <wp:positionH relativeFrom="column">
               <wp:posOffset>4008491</wp:posOffset>
@@ -586,7 +630,7 @@
                     <pic:cNvPicPr/>
                   </pic:nvPicPr>
                   <pic:blipFill>
-                    <a:blip r:embed="rId7" cstate="print">
+                    <a:blip r:embed="rId8" cstate="print">
                       <a:extLst>
                         <a:ext uri="{28A0092B-C50C-407E-A947-70E740481C1C}">
                           <a14:useLocalDpi xmlns:a14="http://schemas.microsoft.com/office/drawing/2010/main" val="0"/>
@@ -1050,7 +1094,7 @@
           <w:szCs w:val="28"/>
         </w:rPr>
         <w:drawing>
-          <wp:anchor distT="0" distB="0" distL="114300" distR="114300" simplePos="0" relativeHeight="251666432" behindDoc="1" locked="0" layoutInCell="1" allowOverlap="1" wp14:anchorId="7B5D8638" wp14:editId="1A009391">
+          <wp:anchor distT="0" distB="0" distL="114300" distR="114300" simplePos="0" relativeHeight="251666432" behindDoc="1" locked="0" layoutInCell="1" allowOverlap="1" wp14:anchorId="7B5D8638" wp14:editId="7895F394">
             <wp:simplePos x="0" y="0"/>
             <wp:positionH relativeFrom="column">
               <wp:posOffset>4004310</wp:posOffset>
@@ -1073,7 +1117,7 @@
                     <pic:cNvPicPr/>
                   </pic:nvPicPr>
                   <pic:blipFill>
-                    <a:blip r:embed="rId8" cstate="print">
+                    <a:blip r:embed="rId9" cstate="print">
                       <a:extLst>
                         <a:ext uri="{28A0092B-C50C-407E-A947-70E740481C1C}">
                           <a14:useLocalDpi xmlns:a14="http://schemas.microsoft.com/office/drawing/2010/main" val="0"/>

</xml_diff>